<commit_message>
Construção da fase na engine godot
</commit_message>
<xml_diff>
--- a/Main Project/Documentacao do projeto.docx
+++ b/Main Project/Documentacao do projeto.docx
@@ -6622,16 +6622,1086 @@
     <w:p>
       <w:pPr>
         <w:pStyle w:val="SubsectionBasico"/>
+      </w:pPr>
+      <w:r>
+        <w:lastRenderedPageBreak/>
+        <w:t>C</w:t>
+      </w:r>
+      <w:r>
+        <w:t>riação de Tiles e definição de física por Tile</w:t>
+      </w:r>
+      <w:r>
+        <w:t>:</w:t>
+      </w:r>
+    </w:p>
+    <w:p>
+      <w:pPr>
+        <w:pStyle w:val="SubsectionBasico"/>
         <w:numPr>
           <w:ilvl w:val="0"/>
           <w:numId w:val="0"/>
         </w:numPr>
+        <w:ind w:left="1800" w:hanging="360"/>
+        <w:rPr>
+          <w:b w:val="0"/>
+          <w:bCs w:val="0"/>
+        </w:rPr>
+      </w:pPr>
+    </w:p>
+    <w:p>
+      <w:pPr>
+        <w:pStyle w:val="SubsectionBasico"/>
+        <w:numPr>
+          <w:ilvl w:val="0"/>
+          <w:numId w:val="0"/>
+        </w:numPr>
+        <w:ind w:left="1440"/>
+        <w:jc w:val="both"/>
+        <w:rPr>
+          <w:b w:val="0"/>
+          <w:bCs w:val="0"/>
+        </w:rPr>
+      </w:pPr>
+      <w:r>
+        <w:rPr>
+          <w:b w:val="0"/>
+          <w:bCs w:val="0"/>
+        </w:rPr>
+        <w:t>Na</w:t>
+      </w:r>
+      <w:r>
+        <w:rPr>
+          <w:b w:val="0"/>
+          <w:bCs w:val="0"/>
+        </w:rPr>
+        <w:t xml:space="preserve"> Godot, um tile </w:t>
+      </w:r>
+      <w:r>
+        <w:rPr>
+          <w:b w:val="0"/>
+          <w:bCs w:val="0"/>
+        </w:rPr>
+        <w:t>é uma estrutura composta por</w:t>
+      </w:r>
+      <w:r>
+        <w:rPr>
+          <w:b w:val="0"/>
+          <w:bCs w:val="0"/>
+        </w:rPr>
+        <w:t xml:space="preserve"> </w:t>
+      </w:r>
+      <w:r>
+        <w:rPr>
+          <w:b w:val="0"/>
+          <w:bCs w:val="0"/>
+        </w:rPr>
+        <w:t>uma região de textur</w:t>
+      </w:r>
+      <w:r>
+        <w:rPr>
+          <w:b w:val="0"/>
+          <w:bCs w:val="0"/>
+        </w:rPr>
+        <w:t xml:space="preserve">a </w:t>
+      </w:r>
+      <w:r>
+        <w:rPr>
+          <w:b w:val="0"/>
+          <w:bCs w:val="0"/>
+        </w:rPr>
+        <w:t>(recorte do PNG),</w:t>
+      </w:r>
+      <w:r>
+        <w:rPr>
+          <w:b w:val="0"/>
+          <w:bCs w:val="0"/>
+        </w:rPr>
+        <w:t xml:space="preserve"> </w:t>
+      </w:r>
+      <w:r>
+        <w:rPr>
+          <w:b w:val="0"/>
+          <w:bCs w:val="0"/>
+        </w:rPr>
+        <w:t>propriedades visuais</w:t>
+      </w:r>
+      <w:r>
+        <w:rPr>
+          <w:b w:val="0"/>
+          <w:bCs w:val="0"/>
+        </w:rPr>
+        <w:t xml:space="preserve">, </w:t>
+      </w:r>
+      <w:r>
+        <w:rPr>
+          <w:b w:val="0"/>
+          <w:bCs w:val="0"/>
+        </w:rPr>
+        <w:t>propriedades físicas (opcionais)</w:t>
+      </w:r>
+      <w:r>
+        <w:rPr>
+          <w:b w:val="0"/>
+          <w:bCs w:val="0"/>
+        </w:rPr>
+        <w:t xml:space="preserve"> e</w:t>
+      </w:r>
+      <w:r>
+        <w:rPr>
+          <w:b w:val="0"/>
+          <w:bCs w:val="0"/>
+        </w:rPr>
+        <w:t xml:space="preserve"> eventualmente navegação ou oclusão.</w:t>
+      </w:r>
+      <w:r>
+        <w:rPr>
+          <w:b w:val="0"/>
+          <w:bCs w:val="0"/>
+        </w:rPr>
+        <w:t xml:space="preserve"> </w:t>
+      </w:r>
+      <w:r>
+        <w:rPr>
+          <w:b w:val="0"/>
+          <w:bCs w:val="0"/>
+        </w:rPr>
+        <w:t xml:space="preserve">Esses tiles são organizados dentro de um </w:t>
+      </w:r>
+      <w:proofErr w:type="spellStart"/>
+      <w:r>
+        <w:rPr>
+          <w:b w:val="0"/>
+          <w:bCs w:val="0"/>
+          <w:i/>
+          <w:iCs/>
+        </w:rPr>
+        <w:t>TileSet</w:t>
+      </w:r>
+      <w:proofErr w:type="spellEnd"/>
+      <w:r>
+        <w:rPr>
+          <w:b w:val="0"/>
+          <w:bCs w:val="0"/>
+        </w:rPr>
+        <w:t xml:space="preserve">, que funciona como uma biblioteca. Já o </w:t>
+      </w:r>
+      <w:proofErr w:type="spellStart"/>
+      <w:r>
+        <w:rPr>
+          <w:b w:val="0"/>
+          <w:bCs w:val="0"/>
+          <w:i/>
+          <w:iCs/>
+        </w:rPr>
+        <w:t>TileMapLayer</w:t>
+      </w:r>
+      <w:proofErr w:type="spellEnd"/>
+      <w:r>
+        <w:rPr>
+          <w:b w:val="0"/>
+          <w:bCs w:val="0"/>
+        </w:rPr>
+        <w:t xml:space="preserve"> é o nó da cena que usa esse </w:t>
+      </w:r>
+      <w:proofErr w:type="spellStart"/>
+      <w:r>
+        <w:rPr>
+          <w:b w:val="0"/>
+          <w:bCs w:val="0"/>
+          <w:i/>
+          <w:iCs/>
+        </w:rPr>
+        <w:t>TileSet</w:t>
+      </w:r>
+      <w:proofErr w:type="spellEnd"/>
+      <w:r>
+        <w:rPr>
+          <w:b w:val="0"/>
+          <w:bCs w:val="0"/>
+        </w:rPr>
+        <w:t xml:space="preserve"> para pintar o mapa.</w:t>
+      </w:r>
+    </w:p>
+    <w:p>
+      <w:pPr>
+        <w:pStyle w:val="SubsectionBasico"/>
+        <w:numPr>
+          <w:ilvl w:val="0"/>
+          <w:numId w:val="0"/>
+        </w:numPr>
         <w:ind w:left="2160"/>
-        <w:rPr>
-          <w:b w:val="0"/>
-          <w:bCs w:val="0"/>
-        </w:rPr>
-      </w:pPr>
+      </w:pPr>
+    </w:p>
+    <w:p>
+      <w:pPr>
+        <w:pStyle w:val="SubsectionBasico"/>
+        <w:numPr>
+          <w:ilvl w:val="0"/>
+          <w:numId w:val="26"/>
+        </w:numPr>
+        <w:jc w:val="both"/>
+      </w:pPr>
+      <w:r>
+        <w:t>Criando tiles a partir de um PNG 16x16</w:t>
+      </w:r>
+      <w:r>
+        <w:t>:</w:t>
+      </w:r>
+      <w:r>
+        <w:rPr>
+          <w:b w:val="0"/>
+          <w:bCs w:val="0"/>
+        </w:rPr>
+        <w:t xml:space="preserve"> </w:t>
+      </w:r>
+    </w:p>
+    <w:p>
+      <w:pPr>
+        <w:pStyle w:val="SubsectionBasico"/>
+        <w:numPr>
+          <w:ilvl w:val="0"/>
+          <w:numId w:val="0"/>
+        </w:numPr>
+        <w:ind w:left="2484"/>
+        <w:jc w:val="both"/>
+      </w:pPr>
+    </w:p>
+    <w:p>
+      <w:pPr>
+        <w:pStyle w:val="SubsectionBasico"/>
+        <w:numPr>
+          <w:ilvl w:val="0"/>
+          <w:numId w:val="27"/>
+        </w:numPr>
+        <w:ind w:left="2484"/>
+        <w:jc w:val="both"/>
+      </w:pPr>
+      <w:r>
+        <w:rPr>
+          <w:b w:val="0"/>
+          <w:bCs w:val="0"/>
+        </w:rPr>
+        <w:t xml:space="preserve">O primeiro passo é adicionar um </w:t>
+      </w:r>
+      <w:proofErr w:type="spellStart"/>
+      <w:r>
+        <w:rPr>
+          <w:b w:val="0"/>
+          <w:bCs w:val="0"/>
+          <w:i/>
+          <w:iCs/>
+        </w:rPr>
+        <w:t>TileMapLayer</w:t>
+      </w:r>
+      <w:proofErr w:type="spellEnd"/>
+      <w:r>
+        <w:rPr>
+          <w:b w:val="0"/>
+          <w:bCs w:val="0"/>
+        </w:rPr>
+        <w:t xml:space="preserve"> à cena. Esse nó será responsável por desenhar o mapa na tela.</w:t>
+      </w:r>
+      <w:r>
+        <w:t xml:space="preserve"> </w:t>
+      </w:r>
+      <w:r>
+        <w:rPr>
+          <w:b w:val="0"/>
+          <w:bCs w:val="0"/>
+        </w:rPr>
+        <w:t xml:space="preserve">Selecionando o </w:t>
+      </w:r>
+      <w:proofErr w:type="spellStart"/>
+      <w:r>
+        <w:rPr>
+          <w:b w:val="0"/>
+          <w:bCs w:val="0"/>
+          <w:i/>
+          <w:iCs/>
+        </w:rPr>
+        <w:t>TileMapLayer</w:t>
+      </w:r>
+      <w:proofErr w:type="spellEnd"/>
+      <w:r>
+        <w:rPr>
+          <w:b w:val="0"/>
+          <w:bCs w:val="0"/>
+        </w:rPr>
+        <w:t xml:space="preserve">, </w:t>
+      </w:r>
+      <w:r>
+        <w:rPr>
+          <w:b w:val="0"/>
+          <w:bCs w:val="0"/>
+        </w:rPr>
+        <w:t>podemos criar</w:t>
+      </w:r>
+      <w:r>
+        <w:rPr>
+          <w:b w:val="0"/>
+          <w:bCs w:val="0"/>
+        </w:rPr>
+        <w:t xml:space="preserve"> um novo </w:t>
+      </w:r>
+      <w:proofErr w:type="spellStart"/>
+      <w:r>
+        <w:rPr>
+          <w:b w:val="0"/>
+          <w:bCs w:val="0"/>
+        </w:rPr>
+        <w:t>TileSet</w:t>
+      </w:r>
+      <w:proofErr w:type="spellEnd"/>
+      <w:r>
+        <w:rPr>
+          <w:b w:val="0"/>
+          <w:bCs w:val="0"/>
+        </w:rPr>
+        <w:t xml:space="preserve"> no Inspector.</w:t>
+      </w:r>
+    </w:p>
+    <w:p>
+      <w:pPr>
+        <w:pStyle w:val="SubsectionBasico"/>
+        <w:numPr>
+          <w:ilvl w:val="0"/>
+          <w:numId w:val="0"/>
+        </w:numPr>
+        <w:ind w:left="2808"/>
+        <w:jc w:val="both"/>
+        <w:rPr>
+          <w:b w:val="0"/>
+          <w:bCs w:val="0"/>
+        </w:rPr>
+      </w:pPr>
+    </w:p>
+    <w:p>
+      <w:pPr>
+        <w:pStyle w:val="SubsectionBasico"/>
+        <w:numPr>
+          <w:ilvl w:val="0"/>
+          <w:numId w:val="27"/>
+        </w:numPr>
+        <w:ind w:left="2484"/>
+        <w:jc w:val="both"/>
+        <w:rPr>
+          <w:b w:val="0"/>
+          <w:bCs w:val="0"/>
+        </w:rPr>
+      </w:pPr>
+      <w:r>
+        <w:rPr>
+          <w:b w:val="0"/>
+          <w:bCs w:val="0"/>
+        </w:rPr>
+        <w:t xml:space="preserve">Dentro do editor do </w:t>
+      </w:r>
+      <w:proofErr w:type="spellStart"/>
+      <w:r>
+        <w:rPr>
+          <w:b w:val="0"/>
+          <w:bCs w:val="0"/>
+          <w:i/>
+          <w:iCs/>
+        </w:rPr>
+        <w:t>TileSet</w:t>
+      </w:r>
+      <w:proofErr w:type="spellEnd"/>
+      <w:r>
+        <w:rPr>
+          <w:b w:val="0"/>
+          <w:bCs w:val="0"/>
+        </w:rPr>
+        <w:t>, precisa</w:t>
+      </w:r>
+      <w:r>
+        <w:rPr>
+          <w:b w:val="0"/>
+          <w:bCs w:val="0"/>
+        </w:rPr>
+        <w:t>mos</w:t>
+      </w:r>
+      <w:r>
+        <w:rPr>
+          <w:b w:val="0"/>
+          <w:bCs w:val="0"/>
+        </w:rPr>
+        <w:t xml:space="preserve"> adicionar uma “</w:t>
+      </w:r>
+      <w:proofErr w:type="spellStart"/>
+      <w:r>
+        <w:rPr>
+          <w:b w:val="0"/>
+          <w:bCs w:val="0"/>
+        </w:rPr>
+        <w:t>Source</w:t>
+      </w:r>
+      <w:proofErr w:type="spellEnd"/>
+      <w:r>
+        <w:rPr>
+          <w:b w:val="0"/>
+          <w:bCs w:val="0"/>
+        </w:rPr>
+        <w:t xml:space="preserve">”. Quando </w:t>
+      </w:r>
+      <w:r>
+        <w:rPr>
+          <w:b w:val="0"/>
+          <w:bCs w:val="0"/>
+        </w:rPr>
+        <w:t>o</w:t>
+      </w:r>
+      <w:r>
+        <w:rPr>
+          <w:b w:val="0"/>
+          <w:bCs w:val="0"/>
+        </w:rPr>
+        <w:t xml:space="preserve"> PNG é um </w:t>
+      </w:r>
+      <w:proofErr w:type="spellStart"/>
+      <w:r>
+        <w:rPr>
+          <w:b w:val="0"/>
+          <w:bCs w:val="0"/>
+          <w:i/>
+          <w:iCs/>
+        </w:rPr>
+        <w:t>spritesheet</w:t>
+      </w:r>
+      <w:proofErr w:type="spellEnd"/>
+      <w:r>
+        <w:rPr>
+          <w:b w:val="0"/>
+          <w:bCs w:val="0"/>
+        </w:rPr>
+        <w:t xml:space="preserve"> organizado em grade regular (como 16x16), o tipo correto de fonte é um Atlas.</w:t>
+      </w:r>
+    </w:p>
+    <w:p>
+      <w:pPr>
+        <w:pStyle w:val="SubsectionBasico"/>
+        <w:numPr>
+          <w:ilvl w:val="0"/>
+          <w:numId w:val="0"/>
+        </w:numPr>
+        <w:ind w:left="324"/>
+        <w:jc w:val="both"/>
+        <w:rPr>
+          <w:b w:val="0"/>
+          <w:bCs w:val="0"/>
+        </w:rPr>
+      </w:pPr>
+    </w:p>
+    <w:p>
+      <w:pPr>
+        <w:pStyle w:val="SubsectionBasico"/>
+        <w:numPr>
+          <w:ilvl w:val="0"/>
+          <w:numId w:val="27"/>
+        </w:numPr>
+        <w:ind w:left="2484"/>
+        <w:jc w:val="both"/>
+        <w:rPr>
+          <w:b w:val="0"/>
+          <w:bCs w:val="0"/>
+        </w:rPr>
+      </w:pPr>
+      <w:r>
+        <w:rPr>
+          <w:b w:val="0"/>
+          <w:bCs w:val="0"/>
+        </w:rPr>
+        <w:t xml:space="preserve">Ao adicionar o Atlas e selecionar o PNG, </w:t>
+      </w:r>
+      <w:r>
+        <w:rPr>
+          <w:b w:val="0"/>
+          <w:bCs w:val="0"/>
+        </w:rPr>
+        <w:t>devemos</w:t>
+      </w:r>
+      <w:r>
+        <w:rPr>
+          <w:b w:val="0"/>
+          <w:bCs w:val="0"/>
+        </w:rPr>
+        <w:t xml:space="preserve"> configurar o “</w:t>
+      </w:r>
+      <w:r>
+        <w:rPr>
+          <w:b w:val="0"/>
+          <w:bCs w:val="0"/>
+          <w:i/>
+          <w:iCs/>
+        </w:rPr>
+        <w:t xml:space="preserve">Texture </w:t>
+      </w:r>
+      <w:proofErr w:type="spellStart"/>
+      <w:r>
+        <w:rPr>
+          <w:b w:val="0"/>
+          <w:bCs w:val="0"/>
+          <w:i/>
+          <w:iCs/>
+        </w:rPr>
+        <w:t>Region</w:t>
+      </w:r>
+      <w:proofErr w:type="spellEnd"/>
+      <w:r>
+        <w:rPr>
+          <w:b w:val="0"/>
+          <w:bCs w:val="0"/>
+          <w:i/>
+          <w:iCs/>
+        </w:rPr>
+        <w:t xml:space="preserve"> </w:t>
+      </w:r>
+      <w:proofErr w:type="spellStart"/>
+      <w:r>
+        <w:rPr>
+          <w:b w:val="0"/>
+          <w:bCs w:val="0"/>
+          <w:i/>
+          <w:iCs/>
+        </w:rPr>
+        <w:t>Size</w:t>
+      </w:r>
+      <w:proofErr w:type="spellEnd"/>
+      <w:r>
+        <w:rPr>
+          <w:b w:val="0"/>
+          <w:bCs w:val="0"/>
+        </w:rPr>
+        <w:t xml:space="preserve">” para 16x16. Isso informa à engine que cada tile ocupa exatamente esse tamanho dentro da imagem. Ao confirmar, a Godot divide automaticamente o </w:t>
+      </w:r>
+      <w:proofErr w:type="spellStart"/>
+      <w:r>
+        <w:rPr>
+          <w:b w:val="0"/>
+          <w:bCs w:val="0"/>
+          <w:i/>
+          <w:iCs/>
+        </w:rPr>
+        <w:t>spritesheet</w:t>
+      </w:r>
+      <w:proofErr w:type="spellEnd"/>
+      <w:r>
+        <w:rPr>
+          <w:b w:val="0"/>
+          <w:bCs w:val="0"/>
+        </w:rPr>
+        <w:t xml:space="preserve"> em múltiplos tiles individuais.</w:t>
+      </w:r>
+    </w:p>
+    <w:p>
+      <w:pPr>
+        <w:pStyle w:val="SubsectionBasico"/>
+        <w:numPr>
+          <w:ilvl w:val="0"/>
+          <w:numId w:val="0"/>
+        </w:numPr>
+        <w:ind w:left="2160"/>
+        <w:rPr>
+          <w:b w:val="0"/>
+          <w:bCs w:val="0"/>
+        </w:rPr>
+      </w:pPr>
+    </w:p>
+    <w:p>
+      <w:pPr>
+        <w:pStyle w:val="SubsectionBasico"/>
+        <w:numPr>
+          <w:ilvl w:val="0"/>
+          <w:numId w:val="26"/>
+        </w:numPr>
+        <w:jc w:val="both"/>
+      </w:pPr>
+      <w:r>
+        <w:t>Aplicando a Física às Tiles criadas:</w:t>
+      </w:r>
+    </w:p>
+    <w:p>
+      <w:pPr>
+        <w:pStyle w:val="SubsectionBasico"/>
+        <w:numPr>
+          <w:ilvl w:val="0"/>
+          <w:numId w:val="0"/>
+        </w:numPr>
+        <w:ind w:left="2160"/>
+        <w:jc w:val="both"/>
+      </w:pPr>
+    </w:p>
+    <w:p>
+      <w:pPr>
+        <w:pStyle w:val="SubsectionBasico"/>
+        <w:numPr>
+          <w:ilvl w:val="0"/>
+          <w:numId w:val="28"/>
+        </w:numPr>
+        <w:jc w:val="both"/>
+        <w:rPr>
+          <w:b w:val="0"/>
+          <w:bCs w:val="0"/>
+        </w:rPr>
+      </w:pPr>
+      <w:r>
+        <w:rPr>
+          <w:b w:val="0"/>
+          <w:bCs w:val="0"/>
+        </w:rPr>
+        <w:t xml:space="preserve">Na Godot 4, a física dos tiles não é configurada no </w:t>
+      </w:r>
+      <w:proofErr w:type="spellStart"/>
+      <w:r>
+        <w:rPr>
+          <w:b w:val="0"/>
+          <w:bCs w:val="0"/>
+          <w:i/>
+          <w:iCs/>
+        </w:rPr>
+        <w:t>TileMapLayer</w:t>
+      </w:r>
+      <w:proofErr w:type="spellEnd"/>
+      <w:r>
+        <w:rPr>
+          <w:b w:val="0"/>
+          <w:bCs w:val="0"/>
+        </w:rPr>
+        <w:t xml:space="preserve">, mas dentro do </w:t>
+      </w:r>
+      <w:proofErr w:type="spellStart"/>
+      <w:r>
+        <w:rPr>
+          <w:b w:val="0"/>
+          <w:bCs w:val="0"/>
+          <w:i/>
+          <w:iCs/>
+        </w:rPr>
+        <w:t>TileSet</w:t>
+      </w:r>
+      <w:proofErr w:type="spellEnd"/>
+      <w:r>
+        <w:rPr>
+          <w:b w:val="0"/>
+          <w:bCs w:val="0"/>
+        </w:rPr>
+        <w:t>.</w:t>
+      </w:r>
+      <w:r>
+        <w:rPr>
+          <w:b w:val="0"/>
+          <w:bCs w:val="0"/>
+        </w:rPr>
+        <w:t xml:space="preserve"> </w:t>
+      </w:r>
+      <w:r>
+        <w:rPr>
+          <w:b w:val="0"/>
+          <w:bCs w:val="0"/>
+        </w:rPr>
+        <w:t>Cada tile pode ter sua própria forma de colisão.</w:t>
+      </w:r>
+    </w:p>
+    <w:p>
+      <w:pPr>
+        <w:pStyle w:val="SubsectionBasico"/>
+        <w:numPr>
+          <w:ilvl w:val="0"/>
+          <w:numId w:val="0"/>
+        </w:numPr>
+        <w:ind w:left="2520"/>
+        <w:jc w:val="both"/>
+        <w:rPr>
+          <w:b w:val="0"/>
+          <w:bCs w:val="0"/>
+        </w:rPr>
+      </w:pPr>
+    </w:p>
+    <w:p>
+      <w:pPr>
+        <w:pStyle w:val="SubsectionBasico"/>
+        <w:numPr>
+          <w:ilvl w:val="0"/>
+          <w:numId w:val="28"/>
+        </w:numPr>
+        <w:jc w:val="both"/>
+        <w:rPr>
+          <w:b w:val="0"/>
+          <w:bCs w:val="0"/>
+        </w:rPr>
+      </w:pPr>
+      <w:r>
+        <w:rPr>
+          <w:b w:val="0"/>
+          <w:bCs w:val="0"/>
+        </w:rPr>
+        <w:t xml:space="preserve">Antes de adicionar colisão a um tile, é necessário criar uma </w:t>
+      </w:r>
+      <w:proofErr w:type="spellStart"/>
+      <w:r>
+        <w:rPr>
+          <w:b w:val="0"/>
+          <w:bCs w:val="0"/>
+          <w:i/>
+          <w:iCs/>
+        </w:rPr>
+        <w:t>Physics</w:t>
+      </w:r>
+      <w:proofErr w:type="spellEnd"/>
+      <w:r>
+        <w:rPr>
+          <w:b w:val="0"/>
+          <w:bCs w:val="0"/>
+        </w:rPr>
+        <w:t xml:space="preserve"> </w:t>
+      </w:r>
+      <w:proofErr w:type="spellStart"/>
+      <w:r>
+        <w:rPr>
+          <w:b w:val="0"/>
+          <w:bCs w:val="0"/>
+          <w:i/>
+          <w:iCs/>
+        </w:rPr>
+        <w:t>Layer</w:t>
+      </w:r>
+      <w:proofErr w:type="spellEnd"/>
+      <w:r>
+        <w:rPr>
+          <w:b w:val="0"/>
+          <w:bCs w:val="0"/>
+        </w:rPr>
+        <w:t xml:space="preserve"> dentro do </w:t>
+      </w:r>
+      <w:proofErr w:type="spellStart"/>
+      <w:r>
+        <w:rPr>
+          <w:b w:val="0"/>
+          <w:bCs w:val="0"/>
+          <w:i/>
+          <w:iCs/>
+        </w:rPr>
+        <w:t>TileSet</w:t>
+      </w:r>
+      <w:proofErr w:type="spellEnd"/>
+      <w:r>
+        <w:rPr>
+          <w:b w:val="0"/>
+          <w:bCs w:val="0"/>
+        </w:rPr>
+        <w:t xml:space="preserve"> (No inspetor)</w:t>
+      </w:r>
+      <w:r>
+        <w:rPr>
+          <w:b w:val="0"/>
+          <w:bCs w:val="0"/>
+        </w:rPr>
+        <w:t>. Essa camada define que o conjunto de tiles poderá ter propriedades físicas.</w:t>
+      </w:r>
+    </w:p>
+    <w:p>
+      <w:pPr>
+        <w:pStyle w:val="SubsectionBasico"/>
+        <w:numPr>
+          <w:ilvl w:val="0"/>
+          <w:numId w:val="0"/>
+        </w:numPr>
+        <w:jc w:val="both"/>
+        <w:rPr>
+          <w:b w:val="0"/>
+          <w:bCs w:val="0"/>
+        </w:rPr>
+      </w:pPr>
+    </w:p>
+    <w:p>
+      <w:pPr>
+        <w:pStyle w:val="SubsectionBasico"/>
+        <w:numPr>
+          <w:ilvl w:val="0"/>
+          <w:numId w:val="28"/>
+        </w:numPr>
+        <w:jc w:val="both"/>
+        <w:rPr>
+          <w:b w:val="0"/>
+          <w:bCs w:val="0"/>
+        </w:rPr>
+      </w:pPr>
+      <w:r>
+        <w:rPr>
+          <w:b w:val="0"/>
+          <w:bCs w:val="0"/>
+        </w:rPr>
+        <w:t xml:space="preserve">Depois de criar a </w:t>
+      </w:r>
+      <w:proofErr w:type="spellStart"/>
+      <w:r>
+        <w:rPr>
+          <w:b w:val="0"/>
+          <w:bCs w:val="0"/>
+          <w:i/>
+          <w:iCs/>
+        </w:rPr>
+        <w:t>Physics</w:t>
+      </w:r>
+      <w:proofErr w:type="spellEnd"/>
+      <w:r>
+        <w:rPr>
+          <w:b w:val="0"/>
+          <w:bCs w:val="0"/>
+          <w:i/>
+          <w:iCs/>
+        </w:rPr>
+        <w:t xml:space="preserve"> </w:t>
+      </w:r>
+      <w:proofErr w:type="spellStart"/>
+      <w:r>
+        <w:rPr>
+          <w:b w:val="0"/>
+          <w:bCs w:val="0"/>
+          <w:i/>
+          <w:iCs/>
+        </w:rPr>
+        <w:t>Layer</w:t>
+      </w:r>
+      <w:proofErr w:type="spellEnd"/>
+      <w:r>
+        <w:rPr>
+          <w:b w:val="0"/>
+          <w:bCs w:val="0"/>
+        </w:rPr>
+        <w:t xml:space="preserve">, ao selecionar um tile específico no modo </w:t>
+      </w:r>
+      <w:r>
+        <w:rPr>
+          <w:b w:val="0"/>
+          <w:bCs w:val="0"/>
+        </w:rPr>
+        <w:t>‘</w:t>
+      </w:r>
+      <w:proofErr w:type="spellStart"/>
+      <w:r>
+        <w:rPr>
+          <w:b w:val="0"/>
+          <w:bCs w:val="0"/>
+          <w:i/>
+          <w:iCs/>
+        </w:rPr>
+        <w:t>Select</w:t>
+      </w:r>
+      <w:proofErr w:type="spellEnd"/>
+      <w:r>
+        <w:rPr>
+          <w:b w:val="0"/>
+          <w:bCs w:val="0"/>
+        </w:rPr>
+        <w:t>’</w:t>
+      </w:r>
+      <w:r>
+        <w:rPr>
+          <w:b w:val="0"/>
+          <w:bCs w:val="0"/>
+        </w:rPr>
+        <w:t xml:space="preserve"> da aba inferior que exibe os tiles</w:t>
+      </w:r>
+      <w:r>
+        <w:rPr>
+          <w:b w:val="0"/>
+          <w:bCs w:val="0"/>
+        </w:rPr>
+        <w:t xml:space="preserve"> (Aba de </w:t>
+      </w:r>
+      <w:proofErr w:type="spellStart"/>
+      <w:r>
+        <w:rPr>
+          <w:b w:val="0"/>
+          <w:bCs w:val="0"/>
+          <w:i/>
+          <w:iCs/>
+        </w:rPr>
+        <w:t>physics</w:t>
+      </w:r>
+      <w:proofErr w:type="spellEnd"/>
+      <w:r>
+        <w:rPr>
+          <w:b w:val="0"/>
+          <w:bCs w:val="0"/>
+        </w:rPr>
+        <w:t>)</w:t>
+      </w:r>
+      <w:r>
+        <w:rPr>
+          <w:b w:val="0"/>
+          <w:bCs w:val="0"/>
+        </w:rPr>
+        <w:t xml:space="preserve">, </w:t>
+      </w:r>
+      <w:r>
+        <w:rPr>
+          <w:b w:val="0"/>
+          <w:bCs w:val="0"/>
+        </w:rPr>
+        <w:t>veremos</w:t>
+      </w:r>
+      <w:r>
+        <w:rPr>
+          <w:b w:val="0"/>
+          <w:bCs w:val="0"/>
+        </w:rPr>
+        <w:t xml:space="preserve"> a opção de </w:t>
+      </w:r>
+      <w:r>
+        <w:rPr>
+          <w:b w:val="0"/>
+          <w:bCs w:val="0"/>
+        </w:rPr>
+        <w:t>criar</w:t>
+      </w:r>
+      <w:r>
+        <w:rPr>
+          <w:b w:val="0"/>
+          <w:bCs w:val="0"/>
+        </w:rPr>
+        <w:t xml:space="preserve"> um polígono de colisão.</w:t>
+      </w:r>
+    </w:p>
+    <w:p>
+      <w:pPr>
+        <w:pStyle w:val="SubsectionBasico"/>
+        <w:numPr>
+          <w:ilvl w:val="0"/>
+          <w:numId w:val="0"/>
+        </w:numPr>
+        <w:jc w:val="both"/>
+        <w:rPr>
+          <w:b w:val="0"/>
+          <w:bCs w:val="0"/>
+        </w:rPr>
+      </w:pPr>
+    </w:p>
+    <w:p>
+      <w:pPr>
+        <w:pStyle w:val="SubsectionBasico"/>
+        <w:numPr>
+          <w:ilvl w:val="0"/>
+          <w:numId w:val="28"/>
+        </w:numPr>
+        <w:jc w:val="both"/>
+        <w:rPr>
+          <w:b w:val="0"/>
+          <w:bCs w:val="0"/>
+        </w:rPr>
+      </w:pPr>
+      <w:r>
+        <w:rPr>
+          <w:b w:val="0"/>
+          <w:bCs w:val="0"/>
+        </w:rPr>
+        <w:t xml:space="preserve">Na aba </w:t>
+      </w:r>
+      <w:r>
+        <w:rPr>
+          <w:b w:val="0"/>
+          <w:bCs w:val="0"/>
+        </w:rPr>
+        <w:t xml:space="preserve">inferior </w:t>
+      </w:r>
+      <w:r>
+        <w:rPr>
+          <w:b w:val="0"/>
+          <w:bCs w:val="0"/>
+        </w:rPr>
+        <w:t>de propriedades dos tiles, há a opção ‘</w:t>
+      </w:r>
+      <w:proofErr w:type="spellStart"/>
+      <w:r>
+        <w:rPr>
+          <w:b w:val="0"/>
+          <w:bCs w:val="0"/>
+        </w:rPr>
+        <w:t>paint</w:t>
+      </w:r>
+      <w:proofErr w:type="spellEnd"/>
+      <w:r>
+        <w:rPr>
+          <w:b w:val="0"/>
+          <w:bCs w:val="0"/>
+        </w:rPr>
+        <w:t>’. Em ‘</w:t>
+      </w:r>
+      <w:proofErr w:type="spellStart"/>
+      <w:r>
+        <w:rPr>
+          <w:b w:val="0"/>
+          <w:bCs w:val="0"/>
+          <w:i/>
+          <w:iCs/>
+        </w:rPr>
+        <w:t>Paint</w:t>
+      </w:r>
+      <w:proofErr w:type="spellEnd"/>
+      <w:r>
+        <w:rPr>
+          <w:b w:val="0"/>
+          <w:bCs w:val="0"/>
+          <w:i/>
+          <w:iCs/>
+        </w:rPr>
+        <w:t xml:space="preserve"> Properties</w:t>
+      </w:r>
+      <w:r>
+        <w:rPr>
+          <w:b w:val="0"/>
+          <w:bCs w:val="0"/>
+        </w:rPr>
+        <w:t>’ devemos selecionar a ‘</w:t>
+      </w:r>
+      <w:proofErr w:type="spellStart"/>
+      <w:r>
+        <w:rPr>
+          <w:b w:val="0"/>
+          <w:bCs w:val="0"/>
+          <w:i/>
+          <w:iCs/>
+        </w:rPr>
+        <w:t>physics</w:t>
+      </w:r>
+      <w:proofErr w:type="spellEnd"/>
+      <w:r>
+        <w:rPr>
+          <w:b w:val="0"/>
+          <w:bCs w:val="0"/>
+          <w:i/>
+          <w:iCs/>
+        </w:rPr>
+        <w:t xml:space="preserve"> </w:t>
+      </w:r>
+      <w:proofErr w:type="spellStart"/>
+      <w:r>
+        <w:rPr>
+          <w:b w:val="0"/>
+          <w:bCs w:val="0"/>
+          <w:i/>
+          <w:iCs/>
+        </w:rPr>
+        <w:t>layer</w:t>
+      </w:r>
+      <w:proofErr w:type="spellEnd"/>
+      <w:r>
+        <w:rPr>
+          <w:b w:val="0"/>
+          <w:bCs w:val="0"/>
+          <w:i/>
+          <w:iCs/>
+        </w:rPr>
+        <w:t>’</w:t>
+      </w:r>
+      <w:r>
+        <w:rPr>
+          <w:b w:val="0"/>
+          <w:bCs w:val="0"/>
+        </w:rPr>
+        <w:t xml:space="preserve"> criada e em sequência selecionar individualmente os tiles que devem ser comportar com a física.</w:t>
+      </w:r>
     </w:p>
     <w:p>
       <w:pPr>
@@ -7776,6 +8846,119 @@
     </w:lvl>
   </w:abstractNum>
   <w:abstractNum w:abstractNumId="9" w15:restartNumberingAfterBreak="0">
+    <w:nsid w:val="2B174F6B"/>
+    <w:multiLevelType w:val="hybridMultilevel"/>
+    <w:tmpl w:val="181C44AC"/>
+    <w:lvl w:ilvl="0" w:tplc="0416000D">
+      <w:start w:val="1"/>
+      <w:numFmt w:val="bullet"/>
+      <w:lvlText w:val=""/>
+      <w:lvlJc w:val="left"/>
+      <w:pPr>
+        <w:ind w:left="2160" w:hanging="360"/>
+      </w:pPr>
+      <w:rPr>
+        <w:rFonts w:ascii="Wingdings" w:hAnsi="Wingdings" w:hint="default"/>
+      </w:rPr>
+    </w:lvl>
+    <w:lvl w:ilvl="1" w:tplc="FFFFFFFF" w:tentative="1">
+      <w:start w:val="1"/>
+      <w:numFmt w:val="bullet"/>
+      <w:lvlText w:val="o"/>
+      <w:lvlJc w:val="left"/>
+      <w:pPr>
+        <w:ind w:left="2880" w:hanging="360"/>
+      </w:pPr>
+      <w:rPr>
+        <w:rFonts w:ascii="Courier New" w:hAnsi="Courier New" w:cs="Courier New" w:hint="default"/>
+      </w:rPr>
+    </w:lvl>
+    <w:lvl w:ilvl="2" w:tplc="FFFFFFFF" w:tentative="1">
+      <w:start w:val="1"/>
+      <w:numFmt w:val="bullet"/>
+      <w:lvlText w:val=""/>
+      <w:lvlJc w:val="left"/>
+      <w:pPr>
+        <w:ind w:left="3600" w:hanging="360"/>
+      </w:pPr>
+      <w:rPr>
+        <w:rFonts w:ascii="Wingdings" w:hAnsi="Wingdings" w:hint="default"/>
+      </w:rPr>
+    </w:lvl>
+    <w:lvl w:ilvl="3" w:tplc="FFFFFFFF" w:tentative="1">
+      <w:start w:val="1"/>
+      <w:numFmt w:val="bullet"/>
+      <w:lvlText w:val=""/>
+      <w:lvlJc w:val="left"/>
+      <w:pPr>
+        <w:ind w:left="4320" w:hanging="360"/>
+      </w:pPr>
+      <w:rPr>
+        <w:rFonts w:ascii="Symbol" w:hAnsi="Symbol" w:hint="default"/>
+      </w:rPr>
+    </w:lvl>
+    <w:lvl w:ilvl="4" w:tplc="FFFFFFFF" w:tentative="1">
+      <w:start w:val="1"/>
+      <w:numFmt w:val="bullet"/>
+      <w:lvlText w:val="o"/>
+      <w:lvlJc w:val="left"/>
+      <w:pPr>
+        <w:ind w:left="5040" w:hanging="360"/>
+      </w:pPr>
+      <w:rPr>
+        <w:rFonts w:ascii="Courier New" w:hAnsi="Courier New" w:cs="Courier New" w:hint="default"/>
+      </w:rPr>
+    </w:lvl>
+    <w:lvl w:ilvl="5" w:tplc="FFFFFFFF" w:tentative="1">
+      <w:start w:val="1"/>
+      <w:numFmt w:val="bullet"/>
+      <w:lvlText w:val=""/>
+      <w:lvlJc w:val="left"/>
+      <w:pPr>
+        <w:ind w:left="5760" w:hanging="360"/>
+      </w:pPr>
+      <w:rPr>
+        <w:rFonts w:ascii="Wingdings" w:hAnsi="Wingdings" w:hint="default"/>
+      </w:rPr>
+    </w:lvl>
+    <w:lvl w:ilvl="6" w:tplc="FFFFFFFF" w:tentative="1">
+      <w:start w:val="1"/>
+      <w:numFmt w:val="bullet"/>
+      <w:lvlText w:val=""/>
+      <w:lvlJc w:val="left"/>
+      <w:pPr>
+        <w:ind w:left="6480" w:hanging="360"/>
+      </w:pPr>
+      <w:rPr>
+        <w:rFonts w:ascii="Symbol" w:hAnsi="Symbol" w:hint="default"/>
+      </w:rPr>
+    </w:lvl>
+    <w:lvl w:ilvl="7" w:tplc="FFFFFFFF" w:tentative="1">
+      <w:start w:val="1"/>
+      <w:numFmt w:val="bullet"/>
+      <w:lvlText w:val="o"/>
+      <w:lvlJc w:val="left"/>
+      <w:pPr>
+        <w:ind w:left="7200" w:hanging="360"/>
+      </w:pPr>
+      <w:rPr>
+        <w:rFonts w:ascii="Courier New" w:hAnsi="Courier New" w:cs="Courier New" w:hint="default"/>
+      </w:rPr>
+    </w:lvl>
+    <w:lvl w:ilvl="8" w:tplc="FFFFFFFF" w:tentative="1">
+      <w:start w:val="1"/>
+      <w:numFmt w:val="bullet"/>
+      <w:lvlText w:val=""/>
+      <w:lvlJc w:val="left"/>
+      <w:pPr>
+        <w:ind w:left="7920" w:hanging="360"/>
+      </w:pPr>
+      <w:rPr>
+        <w:rFonts w:ascii="Wingdings" w:hAnsi="Wingdings" w:hint="default"/>
+      </w:rPr>
+    </w:lvl>
+  </w:abstractNum>
+  <w:abstractNum w:abstractNumId="10" w15:restartNumberingAfterBreak="0">
     <w:nsid w:val="335F6E9A"/>
     <w:multiLevelType w:val="hybridMultilevel"/>
     <w:tmpl w:val="C16CEB00"/>
@@ -7888,7 +9071,7 @@
       </w:rPr>
     </w:lvl>
   </w:abstractNum>
-  <w:abstractNum w:abstractNumId="10" w15:restartNumberingAfterBreak="0">
+  <w:abstractNum w:abstractNumId="11" w15:restartNumberingAfterBreak="0">
     <w:nsid w:val="39E96BDB"/>
     <w:multiLevelType w:val="hybridMultilevel"/>
     <w:tmpl w:val="694643E6"/>
@@ -7976,7 +9159,7 @@
       </w:pPr>
     </w:lvl>
   </w:abstractNum>
-  <w:abstractNum w:abstractNumId="11" w15:restartNumberingAfterBreak="0">
+  <w:abstractNum w:abstractNumId="12" w15:restartNumberingAfterBreak="0">
     <w:nsid w:val="3A7A2200"/>
     <w:multiLevelType w:val="hybridMultilevel"/>
     <w:tmpl w:val="3D1E1620"/>
@@ -8089,7 +9272,7 @@
       </w:rPr>
     </w:lvl>
   </w:abstractNum>
-  <w:abstractNum w:abstractNumId="12" w15:restartNumberingAfterBreak="0">
+  <w:abstractNum w:abstractNumId="13" w15:restartNumberingAfterBreak="0">
     <w:nsid w:val="413544E5"/>
     <w:multiLevelType w:val="hybridMultilevel"/>
     <w:tmpl w:val="A374204C"/>
@@ -8202,7 +9385,7 @@
       </w:rPr>
     </w:lvl>
   </w:abstractNum>
-  <w:abstractNum w:abstractNumId="13" w15:restartNumberingAfterBreak="0">
+  <w:abstractNum w:abstractNumId="14" w15:restartNumberingAfterBreak="0">
     <w:nsid w:val="48DE3F33"/>
     <w:multiLevelType w:val="hybridMultilevel"/>
     <w:tmpl w:val="70E4759E"/>
@@ -8315,7 +9498,7 @@
       </w:rPr>
     </w:lvl>
   </w:abstractNum>
-  <w:abstractNum w:abstractNumId="14" w15:restartNumberingAfterBreak="0">
+  <w:abstractNum w:abstractNumId="15" w15:restartNumberingAfterBreak="0">
     <w:nsid w:val="4D0802C3"/>
     <w:multiLevelType w:val="hybridMultilevel"/>
     <w:tmpl w:val="4FDC2A22"/>
@@ -8428,7 +9611,7 @@
       </w:rPr>
     </w:lvl>
   </w:abstractNum>
-  <w:abstractNum w:abstractNumId="15" w15:restartNumberingAfterBreak="0">
+  <w:abstractNum w:abstractNumId="16" w15:restartNumberingAfterBreak="0">
     <w:nsid w:val="50FB75F6"/>
     <w:multiLevelType w:val="multilevel"/>
     <w:tmpl w:val="66540204"/>
@@ -8577,7 +9760,120 @@
       </w:rPr>
     </w:lvl>
   </w:abstractNum>
-  <w:abstractNum w:abstractNumId="16" w15:restartNumberingAfterBreak="0">
+  <w:abstractNum w:abstractNumId="17" w15:restartNumberingAfterBreak="0">
+    <w:nsid w:val="5B15048B"/>
+    <w:multiLevelType w:val="hybridMultilevel"/>
+    <w:tmpl w:val="FF68F166"/>
+    <w:lvl w:ilvl="0" w:tplc="0416000D">
+      <w:start w:val="1"/>
+      <w:numFmt w:val="bullet"/>
+      <w:lvlText w:val=""/>
+      <w:lvlJc w:val="left"/>
+      <w:pPr>
+        <w:ind w:left="2520" w:hanging="360"/>
+      </w:pPr>
+      <w:rPr>
+        <w:rFonts w:ascii="Wingdings" w:hAnsi="Wingdings" w:hint="default"/>
+      </w:rPr>
+    </w:lvl>
+    <w:lvl w:ilvl="1" w:tplc="04160003" w:tentative="1">
+      <w:start w:val="1"/>
+      <w:numFmt w:val="bullet"/>
+      <w:lvlText w:val="o"/>
+      <w:lvlJc w:val="left"/>
+      <w:pPr>
+        <w:ind w:left="3240" w:hanging="360"/>
+      </w:pPr>
+      <w:rPr>
+        <w:rFonts w:ascii="Courier New" w:hAnsi="Courier New" w:cs="Courier New" w:hint="default"/>
+      </w:rPr>
+    </w:lvl>
+    <w:lvl w:ilvl="2" w:tplc="04160005" w:tentative="1">
+      <w:start w:val="1"/>
+      <w:numFmt w:val="bullet"/>
+      <w:lvlText w:val=""/>
+      <w:lvlJc w:val="left"/>
+      <w:pPr>
+        <w:ind w:left="3960" w:hanging="360"/>
+      </w:pPr>
+      <w:rPr>
+        <w:rFonts w:ascii="Wingdings" w:hAnsi="Wingdings" w:hint="default"/>
+      </w:rPr>
+    </w:lvl>
+    <w:lvl w:ilvl="3" w:tplc="04160001" w:tentative="1">
+      <w:start w:val="1"/>
+      <w:numFmt w:val="bullet"/>
+      <w:lvlText w:val=""/>
+      <w:lvlJc w:val="left"/>
+      <w:pPr>
+        <w:ind w:left="4680" w:hanging="360"/>
+      </w:pPr>
+      <w:rPr>
+        <w:rFonts w:ascii="Symbol" w:hAnsi="Symbol" w:hint="default"/>
+      </w:rPr>
+    </w:lvl>
+    <w:lvl w:ilvl="4" w:tplc="04160003" w:tentative="1">
+      <w:start w:val="1"/>
+      <w:numFmt w:val="bullet"/>
+      <w:lvlText w:val="o"/>
+      <w:lvlJc w:val="left"/>
+      <w:pPr>
+        <w:ind w:left="5400" w:hanging="360"/>
+      </w:pPr>
+      <w:rPr>
+        <w:rFonts w:ascii="Courier New" w:hAnsi="Courier New" w:cs="Courier New" w:hint="default"/>
+      </w:rPr>
+    </w:lvl>
+    <w:lvl w:ilvl="5" w:tplc="04160005" w:tentative="1">
+      <w:start w:val="1"/>
+      <w:numFmt w:val="bullet"/>
+      <w:lvlText w:val=""/>
+      <w:lvlJc w:val="left"/>
+      <w:pPr>
+        <w:ind w:left="6120" w:hanging="360"/>
+      </w:pPr>
+      <w:rPr>
+        <w:rFonts w:ascii="Wingdings" w:hAnsi="Wingdings" w:hint="default"/>
+      </w:rPr>
+    </w:lvl>
+    <w:lvl w:ilvl="6" w:tplc="04160001" w:tentative="1">
+      <w:start w:val="1"/>
+      <w:numFmt w:val="bullet"/>
+      <w:lvlText w:val=""/>
+      <w:lvlJc w:val="left"/>
+      <w:pPr>
+        <w:ind w:left="6840" w:hanging="360"/>
+      </w:pPr>
+      <w:rPr>
+        <w:rFonts w:ascii="Symbol" w:hAnsi="Symbol" w:hint="default"/>
+      </w:rPr>
+    </w:lvl>
+    <w:lvl w:ilvl="7" w:tplc="04160003" w:tentative="1">
+      <w:start w:val="1"/>
+      <w:numFmt w:val="bullet"/>
+      <w:lvlText w:val="o"/>
+      <w:lvlJc w:val="left"/>
+      <w:pPr>
+        <w:ind w:left="7560" w:hanging="360"/>
+      </w:pPr>
+      <w:rPr>
+        <w:rFonts w:ascii="Courier New" w:hAnsi="Courier New" w:cs="Courier New" w:hint="default"/>
+      </w:rPr>
+    </w:lvl>
+    <w:lvl w:ilvl="8" w:tplc="04160005" w:tentative="1">
+      <w:start w:val="1"/>
+      <w:numFmt w:val="bullet"/>
+      <w:lvlText w:val=""/>
+      <w:lvlJc w:val="left"/>
+      <w:pPr>
+        <w:ind w:left="8280" w:hanging="360"/>
+      </w:pPr>
+      <w:rPr>
+        <w:rFonts w:ascii="Wingdings" w:hAnsi="Wingdings" w:hint="default"/>
+      </w:rPr>
+    </w:lvl>
+  </w:abstractNum>
+  <w:abstractNum w:abstractNumId="18" w15:restartNumberingAfterBreak="0">
     <w:nsid w:val="5B9C4793"/>
     <w:multiLevelType w:val="hybridMultilevel"/>
     <w:tmpl w:val="6C7C5338"/>
@@ -8690,7 +9986,7 @@
       </w:rPr>
     </w:lvl>
   </w:abstractNum>
-  <w:abstractNum w:abstractNumId="17" w15:restartNumberingAfterBreak="0">
+  <w:abstractNum w:abstractNumId="19" w15:restartNumberingAfterBreak="0">
     <w:nsid w:val="5BF639DE"/>
     <w:multiLevelType w:val="hybridMultilevel"/>
     <w:tmpl w:val="4DB0C41E"/>
@@ -8803,7 +10099,120 @@
       </w:rPr>
     </w:lvl>
   </w:abstractNum>
-  <w:abstractNum w:abstractNumId="18" w15:restartNumberingAfterBreak="0">
+  <w:abstractNum w:abstractNumId="20" w15:restartNumberingAfterBreak="0">
+    <w:nsid w:val="6054377E"/>
+    <w:multiLevelType w:val="hybridMultilevel"/>
+    <w:tmpl w:val="5C9663CC"/>
+    <w:lvl w:ilvl="0" w:tplc="04160001">
+      <w:start w:val="1"/>
+      <w:numFmt w:val="bullet"/>
+      <w:lvlText w:val=""/>
+      <w:lvlJc w:val="left"/>
+      <w:pPr>
+        <w:ind w:left="2160" w:hanging="360"/>
+      </w:pPr>
+      <w:rPr>
+        <w:rFonts w:ascii="Symbol" w:hAnsi="Symbol" w:hint="default"/>
+      </w:rPr>
+    </w:lvl>
+    <w:lvl w:ilvl="1" w:tplc="04160003" w:tentative="1">
+      <w:start w:val="1"/>
+      <w:numFmt w:val="bullet"/>
+      <w:lvlText w:val="o"/>
+      <w:lvlJc w:val="left"/>
+      <w:pPr>
+        <w:ind w:left="2880" w:hanging="360"/>
+      </w:pPr>
+      <w:rPr>
+        <w:rFonts w:ascii="Courier New" w:hAnsi="Courier New" w:cs="Courier New" w:hint="default"/>
+      </w:rPr>
+    </w:lvl>
+    <w:lvl w:ilvl="2" w:tplc="04160005" w:tentative="1">
+      <w:start w:val="1"/>
+      <w:numFmt w:val="bullet"/>
+      <w:lvlText w:val=""/>
+      <w:lvlJc w:val="left"/>
+      <w:pPr>
+        <w:ind w:left="3600" w:hanging="360"/>
+      </w:pPr>
+      <w:rPr>
+        <w:rFonts w:ascii="Wingdings" w:hAnsi="Wingdings" w:hint="default"/>
+      </w:rPr>
+    </w:lvl>
+    <w:lvl w:ilvl="3" w:tplc="04160001" w:tentative="1">
+      <w:start w:val="1"/>
+      <w:numFmt w:val="bullet"/>
+      <w:lvlText w:val=""/>
+      <w:lvlJc w:val="left"/>
+      <w:pPr>
+        <w:ind w:left="4320" w:hanging="360"/>
+      </w:pPr>
+      <w:rPr>
+        <w:rFonts w:ascii="Symbol" w:hAnsi="Symbol" w:hint="default"/>
+      </w:rPr>
+    </w:lvl>
+    <w:lvl w:ilvl="4" w:tplc="04160003" w:tentative="1">
+      <w:start w:val="1"/>
+      <w:numFmt w:val="bullet"/>
+      <w:lvlText w:val="o"/>
+      <w:lvlJc w:val="left"/>
+      <w:pPr>
+        <w:ind w:left="5040" w:hanging="360"/>
+      </w:pPr>
+      <w:rPr>
+        <w:rFonts w:ascii="Courier New" w:hAnsi="Courier New" w:cs="Courier New" w:hint="default"/>
+      </w:rPr>
+    </w:lvl>
+    <w:lvl w:ilvl="5" w:tplc="04160005" w:tentative="1">
+      <w:start w:val="1"/>
+      <w:numFmt w:val="bullet"/>
+      <w:lvlText w:val=""/>
+      <w:lvlJc w:val="left"/>
+      <w:pPr>
+        <w:ind w:left="5760" w:hanging="360"/>
+      </w:pPr>
+      <w:rPr>
+        <w:rFonts w:ascii="Wingdings" w:hAnsi="Wingdings" w:hint="default"/>
+      </w:rPr>
+    </w:lvl>
+    <w:lvl w:ilvl="6" w:tplc="04160001" w:tentative="1">
+      <w:start w:val="1"/>
+      <w:numFmt w:val="bullet"/>
+      <w:lvlText w:val=""/>
+      <w:lvlJc w:val="left"/>
+      <w:pPr>
+        <w:ind w:left="6480" w:hanging="360"/>
+      </w:pPr>
+      <w:rPr>
+        <w:rFonts w:ascii="Symbol" w:hAnsi="Symbol" w:hint="default"/>
+      </w:rPr>
+    </w:lvl>
+    <w:lvl w:ilvl="7" w:tplc="04160003" w:tentative="1">
+      <w:start w:val="1"/>
+      <w:numFmt w:val="bullet"/>
+      <w:lvlText w:val="o"/>
+      <w:lvlJc w:val="left"/>
+      <w:pPr>
+        <w:ind w:left="7200" w:hanging="360"/>
+      </w:pPr>
+      <w:rPr>
+        <w:rFonts w:ascii="Courier New" w:hAnsi="Courier New" w:cs="Courier New" w:hint="default"/>
+      </w:rPr>
+    </w:lvl>
+    <w:lvl w:ilvl="8" w:tplc="04160005" w:tentative="1">
+      <w:start w:val="1"/>
+      <w:numFmt w:val="bullet"/>
+      <w:lvlText w:val=""/>
+      <w:lvlJc w:val="left"/>
+      <w:pPr>
+        <w:ind w:left="7920" w:hanging="360"/>
+      </w:pPr>
+      <w:rPr>
+        <w:rFonts w:ascii="Wingdings" w:hAnsi="Wingdings" w:hint="default"/>
+      </w:rPr>
+    </w:lvl>
+  </w:abstractNum>
+  <w:abstractNum w:abstractNumId="21" w15:restartNumberingAfterBreak="0">
     <w:nsid w:val="62010AB0"/>
     <w:multiLevelType w:val="hybridMultilevel"/>
     <w:tmpl w:val="7B420E0A"/>
@@ -8916,7 +10325,7 @@
       </w:rPr>
     </w:lvl>
   </w:abstractNum>
-  <w:abstractNum w:abstractNumId="19" w15:restartNumberingAfterBreak="0">
+  <w:abstractNum w:abstractNumId="22" w15:restartNumberingAfterBreak="0">
     <w:nsid w:val="6AC66E31"/>
     <w:multiLevelType w:val="hybridMultilevel"/>
     <w:tmpl w:val="603AFCF0"/>
@@ -9029,7 +10438,7 @@
       </w:rPr>
     </w:lvl>
   </w:abstractNum>
-  <w:abstractNum w:abstractNumId="20" w15:restartNumberingAfterBreak="0">
+  <w:abstractNum w:abstractNumId="23" w15:restartNumberingAfterBreak="0">
     <w:nsid w:val="6F350AFA"/>
     <w:multiLevelType w:val="hybridMultilevel"/>
     <w:tmpl w:val="9648D96E"/>
@@ -9142,7 +10551,7 @@
       </w:rPr>
     </w:lvl>
   </w:abstractNum>
-  <w:abstractNum w:abstractNumId="21" w15:restartNumberingAfterBreak="0">
+  <w:abstractNum w:abstractNumId="24" w15:restartNumberingAfterBreak="0">
     <w:nsid w:val="6FA55A81"/>
     <w:multiLevelType w:val="hybridMultilevel"/>
     <w:tmpl w:val="B9709D0A"/>
@@ -9255,7 +10664,7 @@
       </w:rPr>
     </w:lvl>
   </w:abstractNum>
-  <w:abstractNum w:abstractNumId="22" w15:restartNumberingAfterBreak="0">
+  <w:abstractNum w:abstractNumId="25" w15:restartNumberingAfterBreak="0">
     <w:nsid w:val="74BE6989"/>
     <w:multiLevelType w:val="hybridMultilevel"/>
     <w:tmpl w:val="11040812"/>
@@ -9368,7 +10777,7 @@
       </w:rPr>
     </w:lvl>
   </w:abstractNum>
-  <w:abstractNum w:abstractNumId="23" w15:restartNumberingAfterBreak="0">
+  <w:abstractNum w:abstractNumId="26" w15:restartNumberingAfterBreak="0">
     <w:nsid w:val="7B523EFA"/>
     <w:multiLevelType w:val="hybridMultilevel"/>
     <w:tmpl w:val="710A175E"/>
@@ -9481,7 +10890,7 @@
       </w:rPr>
     </w:lvl>
   </w:abstractNum>
-  <w:abstractNum w:abstractNumId="24" w15:restartNumberingAfterBreak="0">
+  <w:abstractNum w:abstractNumId="27" w15:restartNumberingAfterBreak="0">
     <w:nsid w:val="7F92671E"/>
     <w:multiLevelType w:val="hybridMultilevel"/>
     <w:tmpl w:val="55644636"/>
@@ -9598,7 +11007,7 @@
     <w:abstractNumId w:val="4"/>
   </w:num>
   <w:num w:numId="2" w16cid:durableId="1773817804">
-    <w:abstractNumId w:val="15"/>
+    <w:abstractNumId w:val="16"/>
   </w:num>
   <w:num w:numId="3" w16cid:durableId="1344471530">
     <w:abstractNumId w:val="3"/>
@@ -9607,49 +11016,49 @@
     <w:abstractNumId w:val="8"/>
   </w:num>
   <w:num w:numId="5" w16cid:durableId="679312763">
-    <w:abstractNumId w:val="10"/>
+    <w:abstractNumId w:val="11"/>
   </w:num>
   <w:num w:numId="6" w16cid:durableId="626283518">
-    <w:abstractNumId w:val="23"/>
+    <w:abstractNumId w:val="26"/>
   </w:num>
   <w:num w:numId="7" w16cid:durableId="1614290658">
-    <w:abstractNumId w:val="22"/>
+    <w:abstractNumId w:val="25"/>
   </w:num>
   <w:num w:numId="8" w16cid:durableId="2033530311">
-    <w:abstractNumId w:val="12"/>
+    <w:abstractNumId w:val="13"/>
   </w:num>
   <w:num w:numId="9" w16cid:durableId="236328044">
     <w:abstractNumId w:val="6"/>
   </w:num>
   <w:num w:numId="10" w16cid:durableId="440536377">
-    <w:abstractNumId w:val="20"/>
+    <w:abstractNumId w:val="23"/>
   </w:num>
   <w:num w:numId="11" w16cid:durableId="431051097">
     <w:abstractNumId w:val="0"/>
   </w:num>
   <w:num w:numId="12" w16cid:durableId="1699314174">
-    <w:abstractNumId w:val="18"/>
+    <w:abstractNumId w:val="21"/>
   </w:num>
   <w:num w:numId="13" w16cid:durableId="1420440709">
-    <w:abstractNumId w:val="24"/>
+    <w:abstractNumId w:val="27"/>
   </w:num>
   <w:num w:numId="14" w16cid:durableId="255942723">
-    <w:abstractNumId w:val="16"/>
+    <w:abstractNumId w:val="18"/>
   </w:num>
   <w:num w:numId="15" w16cid:durableId="80640598">
     <w:abstractNumId w:val="5"/>
   </w:num>
   <w:num w:numId="16" w16cid:durableId="2001880651">
-    <w:abstractNumId w:val="17"/>
+    <w:abstractNumId w:val="19"/>
   </w:num>
   <w:num w:numId="17" w16cid:durableId="1140800797">
-    <w:abstractNumId w:val="11"/>
+    <w:abstractNumId w:val="12"/>
   </w:num>
   <w:num w:numId="18" w16cid:durableId="193423893">
-    <w:abstractNumId w:val="21"/>
+    <w:abstractNumId w:val="24"/>
   </w:num>
   <w:num w:numId="19" w16cid:durableId="2015105053">
-    <w:abstractNumId w:val="13"/>
+    <w:abstractNumId w:val="14"/>
   </w:num>
   <w:num w:numId="20" w16cid:durableId="1861966553">
     <w:abstractNumId w:val="1"/>
@@ -9661,13 +11070,22 @@
     <w:abstractNumId w:val="2"/>
   </w:num>
   <w:num w:numId="23" w16cid:durableId="2047555825">
+    <w:abstractNumId w:val="10"/>
+  </w:num>
+  <w:num w:numId="24" w16cid:durableId="1646886121">
+    <w:abstractNumId w:val="15"/>
+  </w:num>
+  <w:num w:numId="25" w16cid:durableId="69474261">
+    <w:abstractNumId w:val="22"/>
+  </w:num>
+  <w:num w:numId="26" w16cid:durableId="1678314562">
+    <w:abstractNumId w:val="20"/>
+  </w:num>
+  <w:num w:numId="27" w16cid:durableId="2137869070">
     <w:abstractNumId w:val="9"/>
   </w:num>
-  <w:num w:numId="24" w16cid:durableId="1646886121">
-    <w:abstractNumId w:val="14"/>
-  </w:num>
-  <w:num w:numId="25" w16cid:durableId="69474261">
-    <w:abstractNumId w:val="19"/>
+  <w:num w:numId="28" w16cid:durableId="1313605357">
+    <w:abstractNumId w:val="17"/>
   </w:num>
 </w:numbering>
 </file>
@@ -10275,7 +11693,6 @@
   <w:style w:type="character" w:default="1" w:styleId="Fontepargpadro">
     <w:name w:val="Default Paragraph Font"/>
     <w:uiPriority w:val="1"/>
-    <w:semiHidden/>
     <w:unhideWhenUsed/>
   </w:style>
   <w:style w:type="table" w:default="1" w:styleId="Tabelanormal">

</xml_diff>

<commit_message>
Reorganização de scripts com uso de FSM e animação de ataque
</commit_message>
<xml_diff>
--- a/Main Project/Documentacao do projeto.docx
+++ b/Main Project/Documentacao do projeto.docx
@@ -8592,49 +8592,7 @@
           <w:b w:val="0"/>
           <w:bCs w:val="0"/>
         </w:rPr>
-        <w:t xml:space="preserve"> (Máscaras) são propriedades fundamentais dos nós de física (como</w:t>
-      </w:r>
-      <w:r>
-        <w:rPr>
-          <w:b w:val="0"/>
-          <w:bCs w:val="0"/>
-        </w:rPr>
-        <w:t xml:space="preserve"> </w:t>
-      </w:r>
-      <w:r>
-        <w:rPr>
-          <w:b w:val="0"/>
-          <w:bCs w:val="0"/>
-        </w:rPr>
-        <w:t>CharacterBody2D`</w:t>
-      </w:r>
-      <w:r>
-        <w:rPr>
-          <w:b w:val="0"/>
-          <w:bCs w:val="0"/>
-        </w:rPr>
-        <w:t xml:space="preserve">, </w:t>
-      </w:r>
-      <w:r>
-        <w:rPr>
-          <w:b w:val="0"/>
-          <w:bCs w:val="0"/>
-        </w:rPr>
-        <w:t>`RigidBody2D</w:t>
-      </w:r>
-      <w:r>
-        <w:rPr>
-          <w:b w:val="0"/>
-          <w:bCs w:val="0"/>
-        </w:rPr>
-        <w:t xml:space="preserve"> </w:t>
-      </w:r>
-      <w:r>
-        <w:rPr>
-          <w:b w:val="0"/>
-          <w:bCs w:val="0"/>
-        </w:rPr>
-        <w:t>``Area2D) usadas para gerenciar colisões de forma eficiente, definindo o que interage com o quê. Eles funcionam como filtros de colisão.</w:t>
+        <w:t xml:space="preserve"> (Máscaras) são propriedades fundamentais dos nós de física (como CharacterBody2D`, `RigidBody2D ``Area2D) usadas para gerenciar colisões de forma eficiente, definindo o que interage com o quê. Eles funcionam como filtros de colisão.</w:t>
       </w:r>
     </w:p>
     <w:p>
@@ -8804,24 +8762,258 @@
         </w:numPr>
         <w:ind w:left="1440"/>
         <w:jc w:val="both"/>
-        <w:rPr>
+      </w:pPr>
+    </w:p>
+    <w:p>
+      <w:pPr>
+        <w:pStyle w:val="SubsectionBasico"/>
+        <w:jc w:val="both"/>
+      </w:pPr>
+      <w:r>
+        <w:t>Máquina de Estados Finitos</w:t>
+      </w:r>
+      <w:r>
+        <w:t xml:space="preserve"> – </w:t>
+      </w:r>
+      <w:proofErr w:type="spellStart"/>
+      <w:r>
+        <w:t>Finite</w:t>
+      </w:r>
+      <w:proofErr w:type="spellEnd"/>
+      <w:r>
+        <w:t xml:space="preserve"> </w:t>
+      </w:r>
+      <w:proofErr w:type="spellStart"/>
+      <w:r>
+        <w:t>State</w:t>
+      </w:r>
+      <w:proofErr w:type="spellEnd"/>
+      <w:r>
+        <w:t xml:space="preserve"> Machine (FSM)</w:t>
+      </w:r>
+      <w:r>
+        <w:t>:</w:t>
+      </w:r>
+    </w:p>
+    <w:p>
+      <w:pPr>
+        <w:pStyle w:val="SubsectionBasico"/>
+        <w:numPr>
+          <w:ilvl w:val="0"/>
+          <w:numId w:val="0"/>
+        </w:numPr>
+        <w:ind w:left="1440"/>
+        <w:jc w:val="both"/>
+      </w:pPr>
+    </w:p>
+    <w:p>
+      <w:pPr>
+        <w:pStyle w:val="SubsectionBasico"/>
+        <w:numPr>
+          <w:ilvl w:val="0"/>
+          <w:numId w:val="0"/>
+        </w:numPr>
+        <w:ind w:left="1440"/>
+        <w:jc w:val="both"/>
+        <w:rPr>
+          <w:b w:val="0"/>
+          <w:bCs w:val="0"/>
+        </w:rPr>
+      </w:pPr>
+      <w:r>
+        <w:rPr>
+          <w:b w:val="0"/>
+          <w:bCs w:val="0"/>
+        </w:rPr>
+        <w:t>C</w:t>
+      </w:r>
+      <w:r>
+        <w:rPr>
+          <w:b w:val="0"/>
+          <w:bCs w:val="0"/>
+        </w:rPr>
+        <w:t>onsiste em um modelo computacional amplamente utilizado no desenvolvimento de sistemas interativos, especialmente em jogos digitais, para organizar e controlar o comportamento de entidades que podem assumir diferentes condições ao longo do tempo.</w:t>
+      </w:r>
+    </w:p>
+    <w:p>
+      <w:pPr>
+        <w:pStyle w:val="SubsectionBasico"/>
+        <w:numPr>
+          <w:ilvl w:val="0"/>
+          <w:numId w:val="0"/>
+        </w:numPr>
+        <w:ind w:left="2160"/>
+        <w:jc w:val="both"/>
+        <w:rPr>
+          <w:b w:val="0"/>
+          <w:bCs w:val="0"/>
+        </w:rPr>
+      </w:pPr>
+    </w:p>
+    <w:p>
+      <w:pPr>
+        <w:pStyle w:val="SubsectionBasico"/>
+        <w:numPr>
+          <w:ilvl w:val="0"/>
+          <w:numId w:val="32"/>
+        </w:numPr>
+        <w:jc w:val="both"/>
+        <w:rPr>
+          <w:b w:val="0"/>
+          <w:bCs w:val="0"/>
+        </w:rPr>
+      </w:pPr>
+      <w:r>
+        <w:rPr>
+          <w:b w:val="0"/>
+          <w:bCs w:val="0"/>
+        </w:rPr>
+        <w:t xml:space="preserve">Nesse modelo, um sistema é descrito por um </w:t>
+      </w:r>
+      <w:r>
+        <w:rPr>
+          <w:b w:val="0"/>
+          <w:bCs w:val="0"/>
           <w:u w:val="single"/>
         </w:rPr>
-      </w:pPr>
+        <w:t>conjunto finito de estados possíveis, e em cada momento a entidade encontra-se em apenas um desses estados.</w:t>
+      </w:r>
+      <w:r>
+        <w:rPr>
+          <w:b w:val="0"/>
+          <w:bCs w:val="0"/>
+        </w:rPr>
+        <w:t xml:space="preserve"> As mudanças entre estados ocorrem por meio de transições, que são acionadas a partir de eventos ou condições específicas do sistema</w:t>
+      </w:r>
     </w:p>
     <w:p>
       <w:pPr>
         <w:pStyle w:val="SubsectionBasico"/>
-        <w:jc w:val="both"/>
-        <w:rPr>
-          <w:u w:val="single"/>
-        </w:rPr>
-      </w:pPr>
-      <w:r>
-        <w:rPr>
-          <w:u w:val="single"/>
-        </w:rPr>
-        <w:t>s</w:t>
+        <w:numPr>
+          <w:ilvl w:val="0"/>
+          <w:numId w:val="0"/>
+        </w:numPr>
+        <w:ind w:left="2160"/>
+        <w:jc w:val="both"/>
+        <w:rPr>
+          <w:b w:val="0"/>
+          <w:bCs w:val="0"/>
+        </w:rPr>
+      </w:pPr>
+    </w:p>
+    <w:p>
+      <w:pPr>
+        <w:pStyle w:val="SubsectionBasico"/>
+        <w:numPr>
+          <w:ilvl w:val="0"/>
+          <w:numId w:val="32"/>
+        </w:numPr>
+        <w:jc w:val="both"/>
+        <w:rPr>
+          <w:b w:val="0"/>
+          <w:bCs w:val="0"/>
+        </w:rPr>
+      </w:pPr>
+      <w:r>
+        <w:rPr>
+          <w:b w:val="0"/>
+          <w:bCs w:val="0"/>
+        </w:rPr>
+        <w:t xml:space="preserve">No contexto do desenvolvimento de jogos, a FSM é empregada para controlar o comportamento de </w:t>
+      </w:r>
+      <w:r>
+        <w:rPr>
+          <w:b w:val="0"/>
+          <w:bCs w:val="0"/>
+        </w:rPr>
+        <w:t>objetos</w:t>
+      </w:r>
+      <w:r>
+        <w:rPr>
+          <w:b w:val="0"/>
+          <w:bCs w:val="0"/>
+        </w:rPr>
+        <w:t>. Dessa forma, ao invés de utilizar múltiplas estruturas condicionais independentes</w:t>
+      </w:r>
+      <w:r>
+        <w:rPr>
+          <w:b w:val="0"/>
+          <w:bCs w:val="0"/>
+        </w:rPr>
+        <w:t xml:space="preserve">, </w:t>
+      </w:r>
+      <w:r>
+        <w:rPr>
+          <w:b w:val="0"/>
+          <w:bCs w:val="0"/>
+        </w:rPr>
+        <w:t>a FSM centraliza o controle do comportamento em um único fluxo organizado.</w:t>
+      </w:r>
+    </w:p>
+    <w:p>
+      <w:pPr>
+        <w:pStyle w:val="SubsectionBasico"/>
+        <w:numPr>
+          <w:ilvl w:val="0"/>
+          <w:numId w:val="0"/>
+        </w:numPr>
+        <w:jc w:val="both"/>
+        <w:rPr>
+          <w:b w:val="0"/>
+          <w:bCs w:val="0"/>
+        </w:rPr>
+      </w:pPr>
+    </w:p>
+    <w:p>
+      <w:pPr>
+        <w:pStyle w:val="SubsectionBasico"/>
+        <w:numPr>
+          <w:ilvl w:val="0"/>
+          <w:numId w:val="32"/>
+        </w:numPr>
+        <w:jc w:val="both"/>
+        <w:rPr>
+          <w:b w:val="0"/>
+          <w:bCs w:val="0"/>
+        </w:rPr>
+      </w:pPr>
+      <w:r>
+        <w:rPr>
+          <w:b w:val="0"/>
+          <w:bCs w:val="0"/>
+        </w:rPr>
+        <w:t>Outra característica relevante das máquinas de estados é a capacidade de priorizar comportamentos. Em um sistema sem FSM, por exemplo, a animação de ataque de um personagem pode ser interrompida por outra animação, como caminhar ou permanecer parado, caso ambas sejam acionadas simultaneamente por diferentes partes do código. Com a implementação de uma FSM, o estado de ataque pode assumir prioridade sobre os demais</w:t>
+      </w:r>
+    </w:p>
+    <w:p>
+      <w:pPr>
+        <w:pStyle w:val="SubsectionBasico"/>
+        <w:numPr>
+          <w:ilvl w:val="0"/>
+          <w:numId w:val="0"/>
+        </w:numPr>
+        <w:ind w:left="1440"/>
+        <w:jc w:val="both"/>
+      </w:pPr>
+    </w:p>
+    <w:p>
+      <w:pPr>
+        <w:pStyle w:val="SubsectionBasico"/>
+        <w:numPr>
+          <w:ilvl w:val="0"/>
+          <w:numId w:val="0"/>
+        </w:numPr>
+        <w:ind w:left="1440"/>
+        <w:jc w:val="both"/>
+      </w:pPr>
+    </w:p>
+    <w:p>
+      <w:pPr>
+        <w:pStyle w:val="SubsectionBasico"/>
+        <w:jc w:val="both"/>
+      </w:pPr>
+      <w:r>
+        <w:t>d</w:t>
       </w:r>
     </w:p>
     <w:p>
@@ -11465,6 +11657,119 @@
     </w:lvl>
   </w:abstractNum>
   <w:abstractNum w:abstractNumId="22" w15:restartNumberingAfterBreak="0">
+    <w:nsid w:val="5FF0341E"/>
+    <w:multiLevelType w:val="hybridMultilevel"/>
+    <w:tmpl w:val="42F2A59E"/>
+    <w:lvl w:ilvl="0" w:tplc="04160001">
+      <w:start w:val="1"/>
+      <w:numFmt w:val="bullet"/>
+      <w:lvlText w:val=""/>
+      <w:lvlJc w:val="left"/>
+      <w:pPr>
+        <w:ind w:left="2160" w:hanging="360"/>
+      </w:pPr>
+      <w:rPr>
+        <w:rFonts w:ascii="Symbol" w:hAnsi="Symbol" w:hint="default"/>
+      </w:rPr>
+    </w:lvl>
+    <w:lvl w:ilvl="1" w:tplc="04160003" w:tentative="1">
+      <w:start w:val="1"/>
+      <w:numFmt w:val="bullet"/>
+      <w:lvlText w:val="o"/>
+      <w:lvlJc w:val="left"/>
+      <w:pPr>
+        <w:ind w:left="2880" w:hanging="360"/>
+      </w:pPr>
+      <w:rPr>
+        <w:rFonts w:ascii="Courier New" w:hAnsi="Courier New" w:cs="Courier New" w:hint="default"/>
+      </w:rPr>
+    </w:lvl>
+    <w:lvl w:ilvl="2" w:tplc="04160005" w:tentative="1">
+      <w:start w:val="1"/>
+      <w:numFmt w:val="bullet"/>
+      <w:lvlText w:val=""/>
+      <w:lvlJc w:val="left"/>
+      <w:pPr>
+        <w:ind w:left="3600" w:hanging="360"/>
+      </w:pPr>
+      <w:rPr>
+        <w:rFonts w:ascii="Wingdings" w:hAnsi="Wingdings" w:hint="default"/>
+      </w:rPr>
+    </w:lvl>
+    <w:lvl w:ilvl="3" w:tplc="04160001" w:tentative="1">
+      <w:start w:val="1"/>
+      <w:numFmt w:val="bullet"/>
+      <w:lvlText w:val=""/>
+      <w:lvlJc w:val="left"/>
+      <w:pPr>
+        <w:ind w:left="4320" w:hanging="360"/>
+      </w:pPr>
+      <w:rPr>
+        <w:rFonts w:ascii="Symbol" w:hAnsi="Symbol" w:hint="default"/>
+      </w:rPr>
+    </w:lvl>
+    <w:lvl w:ilvl="4" w:tplc="04160003" w:tentative="1">
+      <w:start w:val="1"/>
+      <w:numFmt w:val="bullet"/>
+      <w:lvlText w:val="o"/>
+      <w:lvlJc w:val="left"/>
+      <w:pPr>
+        <w:ind w:left="5040" w:hanging="360"/>
+      </w:pPr>
+      <w:rPr>
+        <w:rFonts w:ascii="Courier New" w:hAnsi="Courier New" w:cs="Courier New" w:hint="default"/>
+      </w:rPr>
+    </w:lvl>
+    <w:lvl w:ilvl="5" w:tplc="04160005" w:tentative="1">
+      <w:start w:val="1"/>
+      <w:numFmt w:val="bullet"/>
+      <w:lvlText w:val=""/>
+      <w:lvlJc w:val="left"/>
+      <w:pPr>
+        <w:ind w:left="5760" w:hanging="360"/>
+      </w:pPr>
+      <w:rPr>
+        <w:rFonts w:ascii="Wingdings" w:hAnsi="Wingdings" w:hint="default"/>
+      </w:rPr>
+    </w:lvl>
+    <w:lvl w:ilvl="6" w:tplc="04160001" w:tentative="1">
+      <w:start w:val="1"/>
+      <w:numFmt w:val="bullet"/>
+      <w:lvlText w:val=""/>
+      <w:lvlJc w:val="left"/>
+      <w:pPr>
+        <w:ind w:left="6480" w:hanging="360"/>
+      </w:pPr>
+      <w:rPr>
+        <w:rFonts w:ascii="Symbol" w:hAnsi="Symbol" w:hint="default"/>
+      </w:rPr>
+    </w:lvl>
+    <w:lvl w:ilvl="7" w:tplc="04160003" w:tentative="1">
+      <w:start w:val="1"/>
+      <w:numFmt w:val="bullet"/>
+      <w:lvlText w:val="o"/>
+      <w:lvlJc w:val="left"/>
+      <w:pPr>
+        <w:ind w:left="7200" w:hanging="360"/>
+      </w:pPr>
+      <w:rPr>
+        <w:rFonts w:ascii="Courier New" w:hAnsi="Courier New" w:cs="Courier New" w:hint="default"/>
+      </w:rPr>
+    </w:lvl>
+    <w:lvl w:ilvl="8" w:tplc="04160005" w:tentative="1">
+      <w:start w:val="1"/>
+      <w:numFmt w:val="bullet"/>
+      <w:lvlText w:val=""/>
+      <w:lvlJc w:val="left"/>
+      <w:pPr>
+        <w:ind w:left="7920" w:hanging="360"/>
+      </w:pPr>
+      <w:rPr>
+        <w:rFonts w:ascii="Wingdings" w:hAnsi="Wingdings" w:hint="default"/>
+      </w:rPr>
+    </w:lvl>
+  </w:abstractNum>
+  <w:abstractNum w:abstractNumId="23" w15:restartNumberingAfterBreak="0">
     <w:nsid w:val="6054377E"/>
     <w:multiLevelType w:val="hybridMultilevel"/>
     <w:tmpl w:val="28C6C04E"/>
@@ -11577,7 +11882,7 @@
       </w:rPr>
     </w:lvl>
   </w:abstractNum>
-  <w:abstractNum w:abstractNumId="23" w15:restartNumberingAfterBreak="0">
+  <w:abstractNum w:abstractNumId="24" w15:restartNumberingAfterBreak="0">
     <w:nsid w:val="62010AB0"/>
     <w:multiLevelType w:val="hybridMultilevel"/>
     <w:tmpl w:val="7B420E0A"/>
@@ -11690,7 +11995,7 @@
       </w:rPr>
     </w:lvl>
   </w:abstractNum>
-  <w:abstractNum w:abstractNumId="24" w15:restartNumberingAfterBreak="0">
+  <w:abstractNum w:abstractNumId="25" w15:restartNumberingAfterBreak="0">
     <w:nsid w:val="6AC66E31"/>
     <w:multiLevelType w:val="hybridMultilevel"/>
     <w:tmpl w:val="603AFCF0"/>
@@ -11803,7 +12108,7 @@
       </w:rPr>
     </w:lvl>
   </w:abstractNum>
-  <w:abstractNum w:abstractNumId="25" w15:restartNumberingAfterBreak="0">
+  <w:abstractNum w:abstractNumId="26" w15:restartNumberingAfterBreak="0">
     <w:nsid w:val="6F350AFA"/>
     <w:multiLevelType w:val="hybridMultilevel"/>
     <w:tmpl w:val="9648D96E"/>
@@ -11916,7 +12221,7 @@
       </w:rPr>
     </w:lvl>
   </w:abstractNum>
-  <w:abstractNum w:abstractNumId="26" w15:restartNumberingAfterBreak="0">
+  <w:abstractNum w:abstractNumId="27" w15:restartNumberingAfterBreak="0">
     <w:nsid w:val="6FA55A81"/>
     <w:multiLevelType w:val="hybridMultilevel"/>
     <w:tmpl w:val="B9709D0A"/>
@@ -12029,7 +12334,7 @@
       </w:rPr>
     </w:lvl>
   </w:abstractNum>
-  <w:abstractNum w:abstractNumId="27" w15:restartNumberingAfterBreak="0">
+  <w:abstractNum w:abstractNumId="28" w15:restartNumberingAfterBreak="0">
     <w:nsid w:val="74BE6989"/>
     <w:multiLevelType w:val="hybridMultilevel"/>
     <w:tmpl w:val="11040812"/>
@@ -12142,7 +12447,7 @@
       </w:rPr>
     </w:lvl>
   </w:abstractNum>
-  <w:abstractNum w:abstractNumId="28" w15:restartNumberingAfterBreak="0">
+  <w:abstractNum w:abstractNumId="29" w15:restartNumberingAfterBreak="0">
     <w:nsid w:val="7B523EFA"/>
     <w:multiLevelType w:val="hybridMultilevel"/>
     <w:tmpl w:val="710A175E"/>
@@ -12255,7 +12560,7 @@
       </w:rPr>
     </w:lvl>
   </w:abstractNum>
-  <w:abstractNum w:abstractNumId="29" w15:restartNumberingAfterBreak="0">
+  <w:abstractNum w:abstractNumId="30" w15:restartNumberingAfterBreak="0">
     <w:nsid w:val="7F4003B5"/>
     <w:multiLevelType w:val="hybridMultilevel"/>
     <w:tmpl w:val="441C40E4"/>
@@ -12341,7 +12646,7 @@
       </w:pPr>
     </w:lvl>
   </w:abstractNum>
-  <w:abstractNum w:abstractNumId="30" w15:restartNumberingAfterBreak="0">
+  <w:abstractNum w:abstractNumId="31" w15:restartNumberingAfterBreak="0">
     <w:nsid w:val="7F92671E"/>
     <w:multiLevelType w:val="hybridMultilevel"/>
     <w:tmpl w:val="55644636"/>
@@ -12470,10 +12775,10 @@
     <w:abstractNumId w:val="12"/>
   </w:num>
   <w:num w:numId="6" w16cid:durableId="626283518">
-    <w:abstractNumId w:val="28"/>
+    <w:abstractNumId w:val="29"/>
   </w:num>
   <w:num w:numId="7" w16cid:durableId="1614290658">
-    <w:abstractNumId w:val="27"/>
+    <w:abstractNumId w:val="28"/>
   </w:num>
   <w:num w:numId="8" w16cid:durableId="2033530311">
     <w:abstractNumId w:val="14"/>
@@ -12482,16 +12787,16 @@
     <w:abstractNumId w:val="6"/>
   </w:num>
   <w:num w:numId="10" w16cid:durableId="440536377">
-    <w:abstractNumId w:val="25"/>
+    <w:abstractNumId w:val="26"/>
   </w:num>
   <w:num w:numId="11" w16cid:durableId="431051097">
     <w:abstractNumId w:val="0"/>
   </w:num>
   <w:num w:numId="12" w16cid:durableId="1699314174">
-    <w:abstractNumId w:val="23"/>
+    <w:abstractNumId w:val="24"/>
   </w:num>
   <w:num w:numId="13" w16cid:durableId="1420440709">
-    <w:abstractNumId w:val="30"/>
+    <w:abstractNumId w:val="31"/>
   </w:num>
   <w:num w:numId="14" w16cid:durableId="255942723">
     <w:abstractNumId w:val="20"/>
@@ -12506,7 +12811,7 @@
     <w:abstractNumId w:val="13"/>
   </w:num>
   <w:num w:numId="18" w16cid:durableId="193423893">
-    <w:abstractNumId w:val="26"/>
+    <w:abstractNumId w:val="27"/>
   </w:num>
   <w:num w:numId="19" w16cid:durableId="2015105053">
     <w:abstractNumId w:val="15"/>
@@ -12527,10 +12832,10 @@
     <w:abstractNumId w:val="16"/>
   </w:num>
   <w:num w:numId="25" w16cid:durableId="69474261">
-    <w:abstractNumId w:val="24"/>
+    <w:abstractNumId w:val="25"/>
   </w:num>
   <w:num w:numId="26" w16cid:durableId="1678314562">
-    <w:abstractNumId w:val="22"/>
+    <w:abstractNumId w:val="23"/>
   </w:num>
   <w:num w:numId="27" w16cid:durableId="2137869070">
     <w:abstractNumId w:val="9"/>
@@ -12539,13 +12844,16 @@
     <w:abstractNumId w:val="18"/>
   </w:num>
   <w:num w:numId="29" w16cid:durableId="1560357600">
-    <w:abstractNumId w:val="29"/>
+    <w:abstractNumId w:val="30"/>
   </w:num>
   <w:num w:numId="30" w16cid:durableId="1143423400">
     <w:abstractNumId w:val="11"/>
   </w:num>
   <w:num w:numId="31" w16cid:durableId="1101989503">
     <w:abstractNumId w:val="19"/>
+  </w:num>
+  <w:num w:numId="32" w16cid:durableId="589974411">
+    <w:abstractNumId w:val="22"/>
   </w:num>
 </w:numbering>
 </file>
@@ -13153,7 +13461,6 @@
   <w:style w:type="character" w:default="1" w:styleId="Fontepargpadro">
     <w:name w:val="Default Paragraph Font"/>
     <w:uiPriority w:val="1"/>
-    <w:semiHidden/>
     <w:unhideWhenUsed/>
   </w:style>
   <w:style w:type="table" w:default="1" w:styleId="Tabelanormal">

</xml_diff>